<commit_message>
docs: update README.md and Word documentation with exact live production URLs
</commit_message>
<xml_diff>
--- a/EcoAtlas_Project_Documentation.docx
+++ b/EcoAtlas_Project_Documentation.docx
@@ -43,7 +43,7 @@
       <w:tr>
         <w:tc>
           <w:tcPr>
-            <w:tcW w:type="dxa" w:w="3168"/>
+            <w:tcW w:type="dxa" w:w="3312"/>
             <w:shd w:fill="F1F5F9"/>
             <w:tcMar>
               <w:top w:w="80" w:type="dxa"/>
@@ -66,7 +66,7 @@
         </w:tc>
         <w:tc>
           <w:tcPr>
-            <w:tcW w:type="dxa" w:w="6624"/>
+            <w:tcW w:type="dxa" w:w="6480"/>
             <w:shd w:fill="F8FAFC"/>
             <w:tcMar>
               <w:top w:w="80" w:type="dxa"/>
@@ -90,7 +90,7 @@
       <w:tr>
         <w:tc>
           <w:tcPr>
-            <w:tcW w:type="dxa" w:w="3168"/>
+            <w:tcW w:type="dxa" w:w="3312"/>
             <w:shd w:fill="F1F5F9"/>
             <w:tcMar>
               <w:top w:w="80" w:type="dxa"/>
@@ -113,7 +113,7 @@
         </w:tc>
         <w:tc>
           <w:tcPr>
-            <w:tcW w:type="dxa" w:w="6624"/>
+            <w:tcW w:type="dxa" w:w="6480"/>
             <w:shd w:fill="F8FAFC"/>
             <w:tcMar>
               <w:top w:w="80" w:type="dxa"/>
@@ -126,10 +126,11 @@
             <w:r>
               <w:rPr>
                 <w:rFonts w:ascii="Arial" w:hAnsi="Arial"/>
-                <w:color w:val="1E293B"/>
+                <w:b/>
+                <w:color w:val="10B981"/>
                 <w:sz w:val="19"/>
               </w:rPr>
-              <w:t>https://ecoatlas.vercel.app (or your deployed Vercel link)</w:t>
+              <w:t>https://frontend-ten-psi-18.vercel.app/</w:t>
             </w:r>
           </w:p>
         </w:tc>
@@ -137,7 +138,7 @@
       <w:tr>
         <w:tc>
           <w:tcPr>
-            <w:tcW w:type="dxa" w:w="3168"/>
+            <w:tcW w:type="dxa" w:w="3312"/>
             <w:shd w:fill="F1F5F9"/>
             <w:tcMar>
               <w:top w:w="80" w:type="dxa"/>
@@ -160,7 +161,7 @@
         </w:tc>
         <w:tc>
           <w:tcPr>
-            <w:tcW w:type="dxa" w:w="6624"/>
+            <w:tcW w:type="dxa" w:w="6480"/>
             <w:shd w:fill="F8FAFC"/>
             <w:tcMar>
               <w:top w:w="80" w:type="dxa"/>
@@ -173,10 +174,11 @@
             <w:r>
               <w:rPr>
                 <w:rFonts w:ascii="Arial" w:hAnsi="Arial"/>
-                <w:color w:val="1E293B"/>
+                <w:b/>
+                <w:color w:val="10B981"/>
                 <w:sz w:val="19"/>
               </w:rPr>
-              <w:t>https://ecoatlas-api.onrender.com (API base: /api)</w:t>
+              <w:t>https://ecoatlas-api-j53h.onrender.com/</w:t>
             </w:r>
           </w:p>
         </w:tc>
@@ -184,7 +186,55 @@
       <w:tr>
         <w:tc>
           <w:tcPr>
-            <w:tcW w:type="dxa" w:w="3168"/>
+            <w:tcW w:type="dxa" w:w="3312"/>
+            <w:shd w:fill="F1F5F9"/>
+            <w:tcMar>
+              <w:top w:w="80" w:type="dxa"/>
+              <w:bottom w:w="80" w:type="dxa"/>
+              <w:left w:w="140" w:type="dxa"/>
+              <w:right w:w="140" w:type="dxa"/>
+            </w:tcMar>
+          </w:tcPr>
+          <w:p>
+            <w:r>
+              <w:rPr>
+                <w:rFonts w:ascii="Arial" w:hAnsi="Arial"/>
+                <w:b/>
+                <w:color w:val="0F172A"/>
+                <w:sz w:val="19"/>
+              </w:rPr>
+              <w:t>Interactive OpenAPI Docs</w:t>
+            </w:r>
+          </w:p>
+        </w:tc>
+        <w:tc>
+          <w:tcPr>
+            <w:tcW w:type="dxa" w:w="6480"/>
+            <w:shd w:fill="F8FAFC"/>
+            <w:tcMar>
+              <w:top w:w="80" w:type="dxa"/>
+              <w:bottom w:w="80" w:type="dxa"/>
+              <w:left w:w="140" w:type="dxa"/>
+              <w:right w:w="140" w:type="dxa"/>
+            </w:tcMar>
+          </w:tcPr>
+          <w:p>
+            <w:r>
+              <w:rPr>
+                <w:rFonts w:ascii="Arial" w:hAnsi="Arial"/>
+                <w:b/>
+                <w:color w:val="10B981"/>
+                <w:sz w:val="19"/>
+              </w:rPr>
+              <w:t>https://ecoatlas-api-j53h.onrender.com/docs</w:t>
+            </w:r>
+          </w:p>
+        </w:tc>
+      </w:tr>
+      <w:tr>
+        <w:tc>
+          <w:tcPr>
+            <w:tcW w:type="dxa" w:w="3312"/>
             <w:shd w:fill="F1F5F9"/>
             <w:tcMar>
               <w:top w:w="80" w:type="dxa"/>
@@ -207,7 +257,7 @@
         </w:tc>
         <w:tc>
           <w:tcPr>
-            <w:tcW w:type="dxa" w:w="6624"/>
+            <w:tcW w:type="dxa" w:w="6480"/>
             <w:shd w:fill="F8FAFC"/>
             <w:tcMar>
               <w:top w:w="80" w:type="dxa"/>
@@ -220,7 +270,8 @@
             <w:r>
               <w:rPr>
                 <w:rFonts w:ascii="Arial" w:hAnsi="Arial"/>
-                <w:color w:val="1E293B"/>
+                <w:b/>
+                <w:color w:val="10B981"/>
                 <w:sz w:val="19"/>
               </w:rPr>
               <w:t>https://github.com/12ATHARAV/EcoAtlas</w:t>
@@ -231,7 +282,7 @@
       <w:tr>
         <w:tc>
           <w:tcPr>
-            <w:tcW w:type="dxa" w:w="3168"/>
+            <w:tcW w:type="dxa" w:w="3312"/>
             <w:shd w:fill="F1F5F9"/>
             <w:tcMar>
               <w:top w:w="80" w:type="dxa"/>
@@ -248,13 +299,13 @@
                 <w:color w:val="0F172A"/>
                 <w:sz w:val="19"/>
               </w:rPr>
-              <w:t>Default Demo Login</w:t>
+              <w:t>Default Demo Credentials</w:t>
             </w:r>
           </w:p>
         </w:tc>
         <w:tc>
           <w:tcPr>
-            <w:tcW w:type="dxa" w:w="6624"/>
+            <w:tcW w:type="dxa" w:w="6480"/>
             <w:shd w:fill="F8FAFC"/>
             <w:tcMar>
               <w:top w:w="80" w:type="dxa"/>
@@ -2246,7 +2297,7 @@
           <w:color w:val="0F172A"/>
           <w:sz w:val="32"/>
         </w:rPr>
-        <w:t>7. Cloud Deployment Architecture</w:t>
+        <w:t>7. Production Multi-Cloud Architecture</w:t>
       </w:r>
     </w:p>
     <w:p>
@@ -2259,7 +2310,7 @@
           <w:color w:val="1E293B"/>
           <w:sz w:val="20"/>
         </w:rPr>
-        <w:t>EcoAtlas is architected for seamless multi-cloud distribution:</w:t>
+        <w:t>The EcoAtlas platform is deployed live on cloud infrastructure:</w:t>
       </w:r>
     </w:p>
     <w:p>
@@ -2274,7 +2325,7 @@
           <w:color w:val="0F172A"/>
           <w:sz w:val="19"/>
         </w:rPr>
-        <w:t>Database Layer (Neon.tech):</w:t>
+        <w:t>Vercel Frontend Platform:</w:t>
       </w:r>
       <w:r>
         <w:rPr>
@@ -2282,7 +2333,7 @@
           <w:color w:val="1E293B"/>
           <w:sz w:val="19"/>
         </w:rPr>
-        <w:t xml:space="preserve"> Neon Serverless PostgreSQL with auto-provisioned schemas and instantaneous connection pooling.</w:t>
+        <w:t xml:space="preserve"> Live at https://frontend-ten-psi-18.vercel.app/ with global edge CDN distribution, sub-second TTFB, and SPA routing rewrites.</w:t>
       </w:r>
     </w:p>
     <w:p>
@@ -2297,7 +2348,7 @@
           <w:color w:val="0F172A"/>
           <w:sz w:val="19"/>
         </w:rPr>
-        <w:t>Backend Layer (Render.com):</w:t>
+        <w:t>Render Backend API:</w:t>
       </w:r>
       <w:r>
         <w:rPr>
@@ -2305,7 +2356,7 @@
           <w:color w:val="1E293B"/>
           <w:sz w:val="19"/>
         </w:rPr>
-        <w:t xml:space="preserve"> Python 3.12 Web Service running Uvicorn with automated table creation, on-the-fly admin provisioning, and wildcard CORS regex support.</w:t>
+        <w:t xml:space="preserve"> Live at https://ecoatlas-api-j53h.onrender.com/ with automated ASGI workers, SSL termination, and wildcard CORS support.</w:t>
       </w:r>
     </w:p>
     <w:p>
@@ -2320,7 +2371,7 @@
           <w:color w:val="0F172A"/>
           <w:sz w:val="19"/>
         </w:rPr>
-        <w:t>Frontend Layer (Vercel.com):</w:t>
+        <w:t>Neon Database:</w:t>
       </w:r>
       <w:r>
         <w:rPr>
@@ -2328,7 +2379,30 @@
           <w:color w:val="1E293B"/>
           <w:sz w:val="19"/>
         </w:rPr>
-        <w:t xml:space="preserve"> Single Page Application with dynamic Vite bundler and vercel.json client-side routing rewrites.</w:t>
+        <w:t xml:space="preserve"> Serverless PostgreSQL (us-east-2) with active connection pooling and automatic schema synchronization.</w:t>
+      </w:r>
+    </w:p>
+    <w:p>
+      <w:pPr>
+        <w:pStyle w:val="ListBullet"/>
+        <w:spacing w:before="0" w:after="60" w:line="276" w:lineRule="auto"/>
+      </w:pPr>
+      <w:r>
+        <w:rPr>
+          <w:rFonts w:ascii="Arial" w:hAnsi="Arial"/>
+          <w:b/>
+          <w:color w:val="0F172A"/>
+          <w:sz w:val="19"/>
+        </w:rPr>
+        <w:t>Interactive API Documentation:</w:t>
+      </w:r>
+      <w:r>
+        <w:rPr>
+          <w:rFonts w:ascii="Arial" w:hAnsi="Arial"/>
+          <w:color w:val="1E293B"/>
+          <w:sz w:val="19"/>
+        </w:rPr>
+        <w:t xml:space="preserve"> Interactive Swagger / OpenAPI UI live at https://ecoatlas-api-j53h.onrender.com/docs</w:t>
       </w:r>
     </w:p>
     <w:p>

</xml_diff>